<commit_message>
Fix: obfuscate source index in daily summary
Remove identifiable file paths and folder names from the Source Index
section. Replace with generic numbered references (Source 1, Source 2, etc.)
with dates and time ranges only.
</commit_message>
<xml_diff>
--- a/2026/05/daily/Daily-Summary-2026-05-04.docx
+++ b/2026/05/daily/Daily-Summary-2026-05-04.docx
@@ -388,7 +388,7 @@
         <w:pStyle w:val="ListBullet"/>
       </w:pPr>
       <w:r>
-        <w:t>2026-05-04_08-30.../2026-05-04_08-00-00_Monday Huddle.txt: One-on-one meeting transcript covering vendor knowledge transfer, AI agent design, and weekly priorities.</w:t>
+        <w:t>Source 1 (2026-05-04, 08:00-08:30): One-on-one meeting transcript covering vendor knowledge transfer, AI agent design, and weekly priorities.</w:t>
       </w:r>
     </w:p>
     <w:p>
@@ -396,7 +396,7 @@
         <w:pStyle w:val="ListBullet"/>
       </w:pPr>
       <w:r>
-        <w:t>2026-05-04_09-01.../2026-05-04_09-00-00_Solution Architecture Team Huddle.txt: Team standup transcript covering architecture reviews, project statuses, and process discussions.</w:t>
+        <w:t>Source 2 (2026-05-04, 09:00-09:25): Team standup transcript covering architecture reviews, project statuses, and process discussions.</w:t>
       </w:r>
     </w:p>
     <w:p>
@@ -404,7 +404,7 @@
         <w:pStyle w:val="ListBullet"/>
       </w:pPr>
       <w:r>
-        <w:t>2026-05-04_15-31.../2026-05-04_15-00-00_Peer review prep.txt: Solo work session transcript for solution design document preparation.</w:t>
+        <w:t>Source 3 (2026-05-04, 15:00-17:00): Solo work session transcript for solution design document preparation.</w:t>
       </w:r>
     </w:p>
     <w:sectPr>

</xml_diff>